<commit_message>
Plan, backlog and AI rules
</commit_message>
<xml_diff>
--- a/docs/Who_Guards_The_Guard_Final_Proposal_v2.docx
+++ b/docs/Who_Guards_The_Guard_Final_Proposal_v2.docx
@@ -23615,7 +23615,7 @@
                 <w:sz w:val="17"/>
                 <w:szCs w:val="17"/>
               </w:rPr>
-              <w:t xml:space="preserve">P1</w:t>
+              <w:t xml:space="preserve">P0</w:t>
             </w:r>
           </w:p>
         </w:tc>
@@ -23693,7 +23693,7 @@
                 <w:sz w:val="17"/>
                 <w:szCs w:val="17"/>
               </w:rPr>
-              <w:t xml:space="preserve">A7, B7</w:t>
+              <w:t xml:space="preserve">A6</w:t>
             </w:r>
           </w:p>
         </w:tc>
@@ -26450,7 +26450,7 @@
                 <w:sz w:val="17"/>
                 <w:szCs w:val="17"/>
               </w:rPr>
-              <w:t xml:space="preserve">P1</w:t>
+              <w:t xml:space="preserve">P0</w:t>
             </w:r>
           </w:p>
         </w:tc>
@@ -26528,7 +26528,7 @@
                 <w:sz w:val="17"/>
                 <w:szCs w:val="17"/>
               </w:rPr>
-              <w:t xml:space="preserve">C5, D5</w:t>
+              <w:t xml:space="preserve">D5</w:t>
             </w:r>
           </w:p>
         </w:tc>
@@ -31185,7 +31185,7 @@
           <w:sz w:val="19"/>
           <w:szCs w:val="19"/>
         </w:rPr>
-        <w:t xml:space="preserve">When B6's live evidence lands: observed breach within N attempts, a predicted-vs-observed plot, and the mean absolute gap.</w:t>
+        <w:t xml:space="preserve">Soft dependency on B6 (not blocking): when B6's live evidence lands: observed breach within N attempts, a predicted-vs-observed plot, and the mean absolute gap.</w:t>
       </w:r>
     </w:p>
     <w:p>
@@ -31557,7 +31557,7 @@
           <w:sz w:val="17"/>
           <w:szCs w:val="17"/>
         </w:rPr>
-        <w:t xml:space="preserve">  ·  P1  ·  1 h  ·  Milestone M4  ·  Depends on: A7, B7  ·  Labels: area:measurement, type:experiment</w:t>
+        <w:t xml:space="preserve">  ·  P0  ·  1 h  ·  Milestone M4  ·  Depends on: A6  ·  Labels: area:measurement, type:experiment</w:t>
       </w:r>
     </w:p>
     <w:p>
@@ -31673,7 +31673,7 @@
           <w:sz w:val="19"/>
           <w:szCs w:val="19"/>
         </w:rPr>
-        <w:t xml:space="preserve">2 x 2 table from B7: attack success with the monitor on or off x privilege scoping on or off, and which layer stopped each attack (monitor, executor refusal, privilege denial).</w:t>
+        <w:t xml:space="preserve">If B7 evidence exists, a 2 x 2 table from B7 (otherwise mark it [not run]): attack success with the monitor on or off x privilege scoping on or off, and which layer stopped each attack (monitor, executor refusal, privilege denial).</w:t>
       </w:r>
     </w:p>
     <w:p>
@@ -35446,7 +35446,7 @@
           <w:sz w:val="17"/>
           <w:szCs w:val="17"/>
         </w:rPr>
-        <w:t xml:space="preserve">  ·  P1  ·  1 h  ·  Milestone M5  ·  Depends on: C5, D5  ·  Labels: area:guard, type:docs</w:t>
+        <w:t xml:space="preserve">  ·  P0  ·  1 h  ·  Milestone M5  ·  Depends on: D5  ·  Labels: area:guard, type:docs</w:t>
       </w:r>
     </w:p>
     <w:p>
@@ -35537,6 +35537,24 @@
           <w:szCs w:val="19"/>
         </w:rPr>
         <w:t xml:space="preserve">Tasks</w:t>
+      </w:r>
+    </w:p>
+    <w:p>
+      <w:pPr>
+        <w:pStyle w:val="ListParagraph"/>
+        <w:keepNext/>
+        <w:numPr>
+          <w:ilvl w:val="0"/>
+          <w:numId w:val="5"/>
+        </w:numPr>
+        <w:spacing w:after="30" w:line="264"/>
+      </w:pPr>
+      <w:r>
+        <w:rPr>
+          <w:sz w:val="19"/>
+          <w:szCs w:val="19"/>
+        </w:rPr>
+        <w:t xml:space="preserve">Use the Streamlit console (C5) if it works, otherwise the terminal console (C6) or fixtures replayed by hand.</w:t>
       </w:r>
     </w:p>
     <w:p>
@@ -40153,7 +40171,7 @@
         </w:numPr>
         <w:spacing w:after="50"/>
       </w:pPr>
-      <w:hyperlink w:history="1" r:id="rIdyshm3gvq7njiuo4gla52w">
+      <w:hyperlink w:history="1" r:id="rIdkwkzkywvtbg6siyf5qpmv">
         <w:r>
           <w:rPr>
             <w:rStyle w:val="Hyperlink"/>
@@ -40181,7 +40199,7 @@
         </w:numPr>
         <w:spacing w:after="50"/>
       </w:pPr>
-      <w:hyperlink w:history="1" r:id="rIdfvsty5mxatk_fegwq6lpt">
+      <w:hyperlink w:history="1" r:id="rIdcbrbmzgp_wvgnrtytqvtq">
         <w:r>
           <w:rPr>
             <w:rStyle w:val="Hyperlink"/>
@@ -40209,7 +40227,7 @@
         </w:numPr>
         <w:spacing w:after="50"/>
       </w:pPr>
-      <w:hyperlink w:history="1" r:id="rId4n5nofyjedqy-2sljgliu">
+      <w:hyperlink w:history="1" r:id="rIdtxknakprgcbwyi7a5rutv">
         <w:r>
           <w:rPr>
             <w:rStyle w:val="Hyperlink"/>
@@ -40237,7 +40255,7 @@
         </w:numPr>
         <w:spacing w:after="50"/>
       </w:pPr>
-      <w:hyperlink w:history="1" r:id="rIdy7cal5fflbbcd7whvxz4u">
+      <w:hyperlink w:history="1" r:id="rIdcoc7d1mt-ryvlxlevzrl6">
         <w:r>
           <w:rPr>
             <w:rStyle w:val="Hyperlink"/>
@@ -40265,7 +40283,7 @@
         </w:numPr>
         <w:spacing w:after="50"/>
       </w:pPr>
-      <w:hyperlink w:history="1" r:id="rId3soxirwucyc-01wzzezff">
+      <w:hyperlink w:history="1" r:id="rIdzbcmqvbxnvzsfbxpazrks">
         <w:r>
           <w:rPr>
             <w:rStyle w:val="Hyperlink"/>
@@ -40293,7 +40311,7 @@
         </w:numPr>
         <w:spacing w:after="50"/>
       </w:pPr>
-      <w:hyperlink w:history="1" r:id="rId6gnb5-eps-_swebr8htyv">
+      <w:hyperlink w:history="1" r:id="rIddnb4f0ro1xwaedr6dkrcn">
         <w:r>
           <w:rPr>
             <w:rStyle w:val="Hyperlink"/>
@@ -40321,7 +40339,7 @@
         </w:numPr>
         <w:spacing w:after="50"/>
       </w:pPr>
-      <w:hyperlink w:history="1" r:id="rIdx9vqb9oodaxmsrwcqjmpp">
+      <w:hyperlink w:history="1" r:id="rIdhozm1n3vgf_zumeh8cj0c">
         <w:r>
           <w:rPr>
             <w:rStyle w:val="Hyperlink"/>
@@ -40349,7 +40367,7 @@
         </w:numPr>
         <w:spacing w:after="50"/>
       </w:pPr>
-      <w:hyperlink w:history="1" r:id="rIdruhjut3be_1qjcjzotqj-">
+      <w:hyperlink w:history="1" r:id="rIdjfdhbq91uhub36xkipsux">
         <w:r>
           <w:rPr>
             <w:rStyle w:val="Hyperlink"/>
@@ -40377,7 +40395,7 @@
         </w:numPr>
         <w:spacing w:after="50"/>
       </w:pPr>
-      <w:hyperlink w:history="1" r:id="rIdfpng5tnj_h55oz8s8-oh1">
+      <w:hyperlink w:history="1" r:id="rIdejzpivkrxd6d9d1lqrp4e">
         <w:r>
           <w:rPr>
             <w:rStyle w:val="Hyperlink"/>
@@ -40405,7 +40423,7 @@
         </w:numPr>
         <w:spacing w:after="50"/>
       </w:pPr>
-      <w:hyperlink w:history="1" r:id="rId_bbv9jkvxymamqdw3cgcq">
+      <w:hyperlink w:history="1" r:id="rIduumciue-nmilzprx1yisq">
         <w:r>
           <w:rPr>
             <w:rStyle w:val="Hyperlink"/>
@@ -40433,7 +40451,7 @@
         </w:numPr>
         <w:spacing w:after="50"/>
       </w:pPr>
-      <w:hyperlink w:history="1" r:id="rIdlopcctmuip9te6aqiz_g6">
+      <w:hyperlink w:history="1" r:id="rIdn9tgdkhgcvwdfipfxxsij">
         <w:r>
           <w:rPr>
             <w:rStyle w:val="Hyperlink"/>
@@ -40461,7 +40479,7 @@
         </w:numPr>
         <w:spacing w:after="50"/>
       </w:pPr>
-      <w:hyperlink w:history="1" r:id="rIdxdzcj1xkf-bat-d3rfk2f">
+      <w:hyperlink w:history="1" r:id="rId3mjtvtadqululztyt42jv">
         <w:r>
           <w:rPr>
             <w:rStyle w:val="Hyperlink"/>
@@ -40489,7 +40507,7 @@
         </w:numPr>
         <w:spacing w:after="50"/>
       </w:pPr>
-      <w:hyperlink w:history="1" r:id="rIdhleo_btdtjld_ef5dpntp">
+      <w:hyperlink w:history="1" r:id="rIdzbvvm9rpsk9xs9_-4s_1t">
         <w:r>
           <w:rPr>
             <w:rStyle w:val="Hyperlink"/>
@@ -40517,7 +40535,7 @@
         </w:numPr>
         <w:spacing w:after="50"/>
       </w:pPr>
-      <w:hyperlink w:history="1" r:id="rIdsmoyiwiifw_oj1z1eoxd4">
+      <w:hyperlink w:history="1" r:id="rIdzqxn6trlcrg5rqjlhaa9t">
         <w:r>
           <w:rPr>
             <w:rStyle w:val="Hyperlink"/>
@@ -40545,7 +40563,7 @@
         </w:numPr>
         <w:spacing w:after="50"/>
       </w:pPr>
-      <w:hyperlink w:history="1" r:id="rIdbqbcxdy4crdikb_grc_6i">
+      <w:hyperlink w:history="1" r:id="rIdoq_llxo_zpm3s47v-pkm5">
         <w:r>
           <w:rPr>
             <w:rStyle w:val="Hyperlink"/>
@@ -40573,7 +40591,7 @@
         </w:numPr>
         <w:spacing w:after="50"/>
       </w:pPr>
-      <w:hyperlink w:history="1" r:id="rIdhfmpe9y3zbeehxlnus_7p">
+      <w:hyperlink w:history="1" r:id="rIdz3irqsyetthni8r0a2oyz">
         <w:r>
           <w:rPr>
             <w:rStyle w:val="Hyperlink"/>
@@ -40601,7 +40619,7 @@
         </w:numPr>
         <w:spacing w:after="50"/>
       </w:pPr>
-      <w:hyperlink w:history="1" r:id="rIdufkga0ilcyvu0qfb9h4p-">
+      <w:hyperlink w:history="1" r:id="rIdoing0fvmbjicuiutm7fxi">
         <w:r>
           <w:rPr>
             <w:rStyle w:val="Hyperlink"/>
@@ -40629,7 +40647,7 @@
         </w:numPr>
         <w:spacing w:after="50"/>
       </w:pPr>
-      <w:hyperlink w:history="1" r:id="rIduw96fhgasghw5cb9mq8j2">
+      <w:hyperlink w:history="1" r:id="rId9p7idrj0u9hlx4g65h-tp">
         <w:r>
           <w:rPr>
             <w:rStyle w:val="Hyperlink"/>
@@ -40657,7 +40675,7 @@
         </w:numPr>
         <w:spacing w:after="50"/>
       </w:pPr>
-      <w:hyperlink w:history="1" r:id="rIdxveah3pvvnzvobvt7ilcf">
+      <w:hyperlink w:history="1" r:id="rId4xc4mhcz84_trxzrmlsld">
         <w:r>
           <w:rPr>
             <w:rStyle w:val="Hyperlink"/>
@@ -40685,7 +40703,7 @@
         </w:numPr>
         <w:spacing w:after="50"/>
       </w:pPr>
-      <w:hyperlink w:history="1" r:id="rIdatwa7ljzgm4otj-rube7r">
+      <w:hyperlink w:history="1" r:id="rIdprercvuw5pnx8_mrvjbgs">
         <w:r>
           <w:rPr>
             <w:rStyle w:val="Hyperlink"/>

</xml_diff>